<commit_message>
Remove internal handoffs and publish concise project documentation
</commit_message>
<xml_diff>
--- a/docs/submission/AccessFlow_AI_Disclosure.docx
+++ b/docs/submission/AccessFlow_AI_Disclosure.docx
@@ -195,16 +195,27 @@
       </w:r>
     </w:p>
     <w:p>
+      <w:pPr>
+        <w:keepLines/>
+        <w:keepNext/>
+      </w:pPr>
       <w:r>
         <w:t xml:space="preserve">1. Feature Name: Session controller and tool execution</w:t>
       </w:r>
     </w:p>
     <w:p>
+      <w:pPr>
+        <w:keepLines/>
+        <w:keepNext/>
+      </w:pPr>
       <w:r>
         <w:t xml:space="preserve">2. Self-Generated / AI-Generated / Both: Both</w:t>
       </w:r>
     </w:p>
     <w:p>
+      <w:pPr>
+        <w:keepLines/>
+      </w:pPr>
       <w:r>
         <w:t xml:space="preserve">3. Tools, prompt, output and modification: Tools: OpenAI Codex and Claude Code. Prompt summary: implement the approved plan, preserve teammate ownership, and repair audit findings. Outputs: typed queues, slot revisions, dependency invalidation, cancellation, stale-result rejection and write reconciliation. Modification: iterative agent revisions following user decisions and test failures; human line-level code edits are not documented. Evidence: engine tests and AI_USE_LOG.md.</w:t>
       </w:r>
@@ -215,16 +226,27 @@
       </w:r>
     </w:p>
     <w:p>
+      <w:pPr>
+        <w:keepLines/>
+        <w:keepNext/>
+      </w:pPr>
       <w:r>
         <w:t xml:space="preserve">1. Feature Name: Speech perception and live interruption</w:t>
       </w:r>
     </w:p>
     <w:p>
+      <w:pPr>
+        <w:keepLines/>
+        <w:keepNext/>
+      </w:pPr>
       <w:r>
         <w:t xml:space="preserve">2. Self-Generated / AI-Generated / Both: Both</w:t>
       </w:r>
     </w:p>
     <w:p>
+      <w:pPr>
+        <w:keepLines/>
+      </w:pPr>
       <w:r>
         <w:t xml:space="preserve">3. Tools, prompt, output and modification: Tools: AI coding assistance; runtime Groq Whisper, LiveKit Inference and Deepgram Aura-2. Prompt summary: implement continuous user-started voice sessions, interruptions and approved stop semantics. Outputs: speech ingestion, turn policy and LiveKit bridge. Modification: agent-led fixes after audio/tool probes; Atishay reports four physical microphone checks passed. No new foundation model, fine-tuning or measured population-level accessibility benefit is claimed.</w:t>
       </w:r>
@@ -235,16 +257,27 @@
       </w:r>
     </w:p>
     <w:p>
+      <w:pPr>
+        <w:keepLines/>
+        <w:keepNext/>
+      </w:pPr>
       <w:r>
         <w:t xml:space="preserve">1. Feature Name: Voice interface and navigation extension</w:t>
       </w:r>
     </w:p>
     <w:p>
+      <w:pPr>
+        <w:keepLines/>
+        <w:keepNext/>
+      </w:pPr>
       <w:r>
         <w:t xml:space="preserve">2. Self-Generated / AI-Generated / Both: Both</w:t>
       </w:r>
     </w:p>
     <w:p>
+      <w:pPr>
+        <w:keepLines/>
+      </w:pPr>
       <w:r>
         <w:t xml:space="preserve">3. Tools, prompt, output and modification: Tools: AI coding assistance, generated design references and Google Stitch. Prompt summary: build the selected voice-first interface and an in-car destination-change demonstration. Outputs: browser interface, mock navigation tools and per-room route dashboard. Modification: user-selected design and workflow corrections, agent implementation and browser QA. Navigation is simulated; no actual vehicle control or mapping service is included.</w:t>
       </w:r>
@@ -255,16 +288,27 @@
       </w:r>
     </w:p>
     <w:p>
+      <w:pPr>
+        <w:keepLines/>
+        <w:keepNext/>
+      </w:pPr>
       <w:r>
         <w:t xml:space="preserve">1. Feature Name: Evaluation infrastructure and submission documentation</w:t>
       </w:r>
     </w:p>
     <w:p>
+      <w:pPr>
+        <w:keepLines/>
+        <w:keepNext/>
+      </w:pPr>
       <w:r>
         <w:t xml:space="preserve">2. Self-Generated / AI-Generated / Both: Both</w:t>
       </w:r>
     </w:p>
     <w:p>
+      <w:pPr>
+        <w:keepLines/>
+      </w:pPr>
       <w:r>
         <w:t xml:space="preserve">3. Tools, prompt, output and modification: Tools: OpenAI Codex and other documented coding-agent assistance. Prompt summary: audit both branches, test the combined project, package official FDB-v3 reproduction, and prepare documentation. Outputs: regression tests, metrics, dependency locks, Docker/replay scripts, audit reports and slides. Modification: repeated agent review against reproduced failures. Latest software suite: 1,614 passed and 8 skipped. Official judged score is not available; software tests are not benchmark accuracy.</w:t>
       </w:r>

</xml_diff>

<commit_message>
Sign project AI disclosure with supplied signature
</commit_message>
<xml_diff>
--- a/docs/submission/AccessFlow_AI_Disclosure.docx
+++ b/docs/submission/AccessFlow_AI_Disclosure.docx
@@ -32,7 +32,7 @@
     </w:p>
     <w:p>
       <w:r>
-        <w:t xml:space="preserve">Team Name: AccessFlow (confirm this matches registration)</w:t>
+        <w:t>Team Name: AccessFlow</w:t>
       </w:r>
     </w:p>
     <w:p>
@@ -47,7 +47,7 @@
     </w:p>
     <w:p>
       <w:r>
-        <w:t xml:space="preserve">Submission Date: 30 September 2026 (release date; actual form submission time must be confirmed)</w:t>
+        <w:t>Submission Date: 1 October 2026</w:t>
       </w:r>
     </w:p>
     <w:p/>
@@ -341,12 +341,12 @@
     </w:p>
     <w:p>
       <w:r>
-        <w:t xml:space="preserve">AI usage compliance confirmation: representative review and confirmation required before signing.</w:t>
+        <w:t>AI usage complies with guidelines and policies. Yes</w:t>
       </w:r>
     </w:p>
     <w:p>
       <w:r>
-        <w:t xml:space="preserve">Data rights confirmation: representative review and agreement required before signing. No proprietary/private corpus or provider keys are intentionally published; released benchmark media remain outside Git.</w:t>
+        <w:t>No proprietary or copyrighted data misused. I Agree</w:t>
       </w:r>
     </w:p>
     <w:p/>
@@ -383,12 +383,46 @@
     </w:p>
     <w:p>
       <w:r>
-        <w:t xml:space="preserve">Signature: ____________________ (human representative must sign)</w:t>
+        <w:t xml:space="preserve">Signature: </w:t>
+      </w:r>
+      <w:r>
+        <w:drawing>
+          <wp:inline xmlns:a="http://schemas.openxmlformats.org/drawingml/2006/main" xmlns:pic="http://schemas.openxmlformats.org/drawingml/2006/picture">
+            <wp:extent cx="1234440" cy="784836"/>
+            <wp:docPr id="1" name="Picture 1"/>
+            <wp:cNvGraphicFramePr>
+              <a:graphicFrameLocks noChangeAspect="1"/>
+            </wp:cNvGraphicFramePr>
+            <a:graphic>
+              <a:graphicData uri="http://schemas.openxmlformats.org/drawingml/2006/picture">
+                <pic:pic>
+                  <pic:nvPicPr>
+                    <pic:cNvPr id="0" name="mridul sign.png"/>
+                    <pic:cNvPicPr/>
+                  </pic:nvPicPr>
+                  <pic:blipFill>
+                    <a:blip r:embed="rId8"/>
+                    <a:stretch>
+                      <a:fillRect/>
+                    </a:stretch>
+                  </pic:blipFill>
+                  <pic:spPr>
+                    <a:xfrm>
+                      <a:off x="0" y="0"/>
+                      <a:ext cx="1234440" cy="784836"/>
+                    </a:xfrm>
+                    <a:prstGeom prst="rect"/>
+                  </pic:spPr>
+                </pic:pic>
+              </a:graphicData>
+            </a:graphic>
+          </wp:inline>
+        </w:drawing>
       </w:r>
     </w:p>
     <w:p>
       <w:r>
-        <w:t xml:space="preserve">Date: ____________________ (date of actual signature)</w:t>
+        <w:t>Date: 1 October 2026</w:t>
       </w:r>
     </w:p>
     <w:p/>

</xml_diff>